<commit_message>
feat: v1.2 — card-format visual redesign, live Hermes screenshots + skill categories, no YouTube links in deck/LG
- HARD RULES: all content slides render as numbered visual cards; comment-only
  commands never render; YouTube links stripped from PPT+LG (labs keep videos)
- Live visuals from a local Hermes install: Dashboard/Skills/Kanban screenshots
  + 19 skill categories (97 skills) as tile grids
- Lab 1 rewritten around the official install methods (script/PowerShell/Desktop/source/Nix)
- v1.2 VCR rows in LP+LG; v1.1 archived; README updated

Co-Authored-By: Claude Opus 4.8 (1M context) <noreply@anthropic.com>
</commit_message>
<xml_diff>
--- a/courseware/LP-Human-AI Workforce with Autonomous AI Agents.docx
+++ b/courseware/LP-Human-AI Workforce with Autonomous AI Agents.docx
@@ -179,7 +179,7 @@
           <w:color w:val="1F6FEB"/>
           <w:sz w:val="24"/>
         </w:rPr>
-        <w:t>Version 1.1</w:t>
+        <w:t>Version 1.2</w:t>
       </w:r>
     </w:p>
     <w:p>
@@ -381,6 +381,64 @@
                 <w:sz w:val="19"/>
               </w:rPr>
               <w:t>Revised to a 2-day plan (Day 1: Topics 1 &amp; 2; Day 2: Topic 3 &amp; final assessment). Hermes expanded to 14 labs, OpenClaw to 12, Paperclip to 8 (34 labs total). Learning outcomes aligned to the Course Proposal / TSC; per-lab reference videos added.</w:t>
+            </w:r>
+          </w:p>
+        </w:tc>
+        <w:tc>
+          <w:tcPr>
+            <w:tcW w:type="dxa" w:w="2160"/>
+          </w:tcPr>
+          <w:p>
+            <w:r/>
+            <w:r>
+              <w:rPr>
+                <w:sz w:val="19"/>
+              </w:rPr>
+              <w:t>Dr. Alfred Ang</w:t>
+            </w:r>
+          </w:p>
+        </w:tc>
+      </w:tr>
+      <w:tr>
+        <w:tc>
+          <w:tcPr>
+            <w:tcW w:type="dxa" w:w="2160"/>
+          </w:tcPr>
+          <w:p>
+            <w:r/>
+            <w:r>
+              <w:rPr>
+                <w:sz w:val="19"/>
+              </w:rPr>
+              <w:t>1.2</w:t>
+            </w:r>
+          </w:p>
+        </w:tc>
+        <w:tc>
+          <w:tcPr>
+            <w:tcW w:type="dxa" w:w="2160"/>
+          </w:tcPr>
+          <w:p>
+            <w:r/>
+            <w:r>
+              <w:rPr>
+                <w:sz w:val="19"/>
+              </w:rPr>
+              <w:t>14 July 2026</w:t>
+            </w:r>
+          </w:p>
+        </w:tc>
+        <w:tc>
+          <w:tcPr>
+            <w:tcW w:type="dxa" w:w="2160"/>
+          </w:tcPr>
+          <w:p>
+            <w:r/>
+            <w:r>
+              <w:rPr>
+                <w:sz w:val="19"/>
+              </w:rPr>
+              <w:t>Visual redesign: all content slides card-format; YouTube links removed from the deck and Learner Guide (videos remain in the labs); live Hermes screenshots and skill-category grids added; Hermes install lab expanded with the official install methods.</w:t>
             </w:r>
           </w:p>
         </w:tc>

</xml_diff>